<commit_message>
feat(lab-09): add pytest pythonpath, parallel processing, profiling, and Variant 4 docx report
</commit_message>
<xml_diff>
--- a/Lab_09/9.docx
+++ b/Lab_09/9.docx
@@ -493,15 +493,7 @@
         <w:jc w:val="both"/>
       </w:pPr>
       <w:r>
-        <w:t xml:space="preserve">модель рахунки з полями: назва, клієнт, рік видання, кількість сторінок, та збережену функціональність </w:t>
-      </w:r>
-      <w:proofErr w:type="spellStart"/>
-      <w:r>
-        <w:t>проєкту</w:t>
-      </w:r>
-      <w:proofErr w:type="spellEnd"/>
-      <w:r>
-        <w:t xml:space="preserve"> (додавання рахунки, пошук за клієнтом, фільтрація за роком, рахунок з найбільшою кількістю сторінок, середня кількість сторінок);</w:t>
+        <w:t>модель рахунку з полями: номер рахунку, ім'я клієнта, баланс та збережену функціональність проєкту (поповнення, списання, перевірка балансу, пошук рахунку, обчислення загальної суми коштів);</w:t>
       </w:r>
     </w:p>
     <w:p>
@@ -751,79 +743,7 @@
         <w:jc w:val="both"/>
       </w:pPr>
       <w:r>
-        <w:t xml:space="preserve">Предметна область – система банківських рахунків. Книга (клас </w:t>
-      </w:r>
-      <w:proofErr w:type="spellStart"/>
-      <w:r>
-        <w:t>Book</w:t>
-      </w:r>
-      <w:proofErr w:type="spellEnd"/>
-      <w:r>
-        <w:t>) описується назвою, клієнтом, роком видання та кількістю сторінок і є незмінною (</w:t>
-      </w:r>
-      <w:proofErr w:type="spellStart"/>
-      <w:r>
-        <w:t>frozen</w:t>
-      </w:r>
-      <w:proofErr w:type="spellEnd"/>
-      <w:r>
-        <w:t xml:space="preserve"> </w:t>
-      </w:r>
-      <w:proofErr w:type="spellStart"/>
-      <w:r>
-        <w:t>dataclass</w:t>
-      </w:r>
-      <w:proofErr w:type="spellEnd"/>
-      <w:r>
-        <w:t xml:space="preserve"> зі </w:t>
-      </w:r>
-      <w:proofErr w:type="spellStart"/>
-      <w:r>
-        <w:t>slots</w:t>
-      </w:r>
-      <w:proofErr w:type="spellEnd"/>
-      <w:r>
-        <w:t xml:space="preserve">). При створенні виконується </w:t>
-      </w:r>
-      <w:proofErr w:type="spellStart"/>
-      <w:r>
-        <w:t>валідація</w:t>
-      </w:r>
-      <w:proofErr w:type="spellEnd"/>
-      <w:r>
-        <w:t xml:space="preserve">: назва й клієнт не можуть бути порожніми, рік має бути в діапазоні 1–2100, кількість сторінок – додатною. Каталог (клас </w:t>
-      </w:r>
-      <w:proofErr w:type="spellStart"/>
-      <w:r>
-        <w:t>BookCatalog</w:t>
-      </w:r>
-      <w:proofErr w:type="spellEnd"/>
-      <w:r>
-        <w:t xml:space="preserve">) зберігає рахунки в пам’яті, є </w:t>
-      </w:r>
-      <w:proofErr w:type="spellStart"/>
-      <w:r>
-        <w:t>потокобезпечним</w:t>
-      </w:r>
-      <w:proofErr w:type="spellEnd"/>
-      <w:r>
-        <w:t xml:space="preserve"> (</w:t>
-      </w:r>
-      <w:proofErr w:type="spellStart"/>
-      <w:r>
-        <w:t>RLock</w:t>
-      </w:r>
-      <w:proofErr w:type="spellEnd"/>
-      <w:r>
-        <w:t xml:space="preserve">) і підтримує версію даних, яка збільшується після кожної зміни; саме версія використовується для </w:t>
-      </w:r>
-      <w:proofErr w:type="spellStart"/>
-      <w:r>
-        <w:t>інвалідації</w:t>
-      </w:r>
-      <w:proofErr w:type="spellEnd"/>
-      <w:r>
-        <w:t xml:space="preserve"> кешу.</w:t>
+        <w:t>Предметна область – система банківських рахунків. Банківський рахунок (клас AccountData) описується номером рахунку та балансом. Каталог банківських рахунків зберігає рахунки в пам'яті, підтримує потокобезпечні операції поповнення та списання через threading.Lock (клас ThreadSafeAccount), розрахунок балансів, статистики та версіонування для коректної інвалідації кешу.</w:t>
       </w:r>
     </w:p>
     <w:p>
@@ -833,23 +753,7 @@
         <w:jc w:val="both"/>
       </w:pPr>
       <w:r>
-        <w:t xml:space="preserve">Для експериментів генератор </w:t>
-      </w:r>
-      <w:proofErr w:type="spellStart"/>
-      <w:r>
-        <w:t>generate_books</w:t>
-      </w:r>
-      <w:proofErr w:type="spellEnd"/>
-      <w:r>
-        <w:t xml:space="preserve"> створює відтворюваний набір (</w:t>
-      </w:r>
-      <w:proofErr w:type="spellStart"/>
-      <w:r>
-        <w:t>seed</w:t>
-      </w:r>
-      <w:proofErr w:type="spellEnd"/>
-      <w:r>
-        <w:t xml:space="preserve"> = 42): 500 клієнтів, роки 1950–2025, кількість сторінок 80–1200. Відтворюваність дає змогу порівнювати різні реалізації на тих самих вхідних даних.</w:t>
+        <w:t>Для експериментів генератор generate_synthetic_accounts створює відтворюваний набір (seed = 42): 100 000 рахунків із балансами від 10.0 до 50 000.0 грн. Відтворюваність дає змогу порівнювати різні реалізації на тих самих вхідних даних.</w:t>
       </w:r>
     </w:p>
     <w:p>
@@ -3387,167 +3291,8 @@
               <w:keepNext/>
               <w:keepLines/>
             </w:pPr>
-            <w:proofErr w:type="spellStart"/>
-            <w:r>
-              <w:rPr>
-                <w:rFonts w:ascii="Courier New" w:eastAsia="Courier New" w:hAnsi="Courier New" w:cs="Courier New"/>
-                <w:sz w:val="18"/>
-                <w:szCs w:val="18"/>
-              </w:rPr>
-              <w:t>def</w:t>
-            </w:r>
-            <w:proofErr w:type="spellEnd"/>
-            <w:r>
-              <w:rPr>
-                <w:rFonts w:ascii="Courier New" w:eastAsia="Courier New" w:hAnsi="Courier New" w:cs="Courier New"/>
-                <w:sz w:val="18"/>
-                <w:szCs w:val="18"/>
-              </w:rPr>
-              <w:t xml:space="preserve"> </w:t>
-            </w:r>
-            <w:proofErr w:type="spellStart"/>
-            <w:r>
-              <w:rPr>
-                <w:rFonts w:ascii="Courier New" w:eastAsia="Courier New" w:hAnsi="Courier New" w:cs="Courier New"/>
-                <w:sz w:val="18"/>
-                <w:szCs w:val="18"/>
-              </w:rPr>
-              <w:t>pages_python</w:t>
-            </w:r>
-            <w:proofErr w:type="spellEnd"/>
-            <w:r>
-              <w:rPr>
-                <w:rFonts w:ascii="Courier New" w:eastAsia="Courier New" w:hAnsi="Courier New" w:cs="Courier New"/>
-                <w:sz w:val="18"/>
-                <w:szCs w:val="18"/>
-              </w:rPr>
-              <w:t>(</w:t>
-            </w:r>
-            <w:proofErr w:type="spellStart"/>
-            <w:r>
-              <w:rPr>
-                <w:rFonts w:ascii="Courier New" w:eastAsia="Courier New" w:hAnsi="Courier New" w:cs="Courier New"/>
-                <w:sz w:val="18"/>
-                <w:szCs w:val="18"/>
-              </w:rPr>
-              <w:t>books</w:t>
-            </w:r>
-            <w:proofErr w:type="spellEnd"/>
-            <w:r>
-              <w:rPr>
-                <w:rFonts w:ascii="Courier New" w:eastAsia="Courier New" w:hAnsi="Courier New" w:cs="Courier New"/>
-                <w:sz w:val="18"/>
-                <w:szCs w:val="18"/>
-              </w:rPr>
-              <w:t xml:space="preserve">: </w:t>
-            </w:r>
-            <w:proofErr w:type="spellStart"/>
-            <w:r>
-              <w:rPr>
-                <w:rFonts w:ascii="Courier New" w:eastAsia="Courier New" w:hAnsi="Courier New" w:cs="Courier New"/>
-                <w:sz w:val="18"/>
-                <w:szCs w:val="18"/>
-              </w:rPr>
-              <w:t>Sequence</w:t>
-            </w:r>
-            <w:proofErr w:type="spellEnd"/>
-            <w:r>
-              <w:rPr>
-                <w:rFonts w:ascii="Courier New" w:eastAsia="Courier New" w:hAnsi="Courier New" w:cs="Courier New"/>
-                <w:sz w:val="18"/>
-                <w:szCs w:val="18"/>
-              </w:rPr>
-              <w:t>[</w:t>
-            </w:r>
-            <w:proofErr w:type="spellStart"/>
-            <w:r>
-              <w:rPr>
-                <w:rFonts w:ascii="Courier New" w:eastAsia="Courier New" w:hAnsi="Courier New" w:cs="Courier New"/>
-                <w:sz w:val="18"/>
-                <w:szCs w:val="18"/>
-              </w:rPr>
-              <w:t>Book</w:t>
-            </w:r>
-            <w:proofErr w:type="spellEnd"/>
-            <w:r>
-              <w:rPr>
-                <w:rFonts w:ascii="Courier New" w:eastAsia="Courier New" w:hAnsi="Courier New" w:cs="Courier New"/>
-                <w:sz w:val="18"/>
-                <w:szCs w:val="18"/>
-              </w:rPr>
-              <w:t xml:space="preserve">]) -&gt; </w:t>
-            </w:r>
-            <w:proofErr w:type="spellStart"/>
-            <w:r>
-              <w:rPr>
-                <w:rFonts w:ascii="Courier New" w:eastAsia="Courier New" w:hAnsi="Courier New" w:cs="Courier New"/>
-                <w:sz w:val="18"/>
-                <w:szCs w:val="18"/>
-              </w:rPr>
-              <w:t>dict</w:t>
-            </w:r>
-            <w:proofErr w:type="spellEnd"/>
-            <w:r>
-              <w:rPr>
-                <w:rFonts w:ascii="Courier New" w:eastAsia="Courier New" w:hAnsi="Courier New" w:cs="Courier New"/>
-                <w:sz w:val="18"/>
-                <w:szCs w:val="18"/>
-              </w:rPr>
-              <w:t>[</w:t>
-            </w:r>
-            <w:proofErr w:type="spellStart"/>
-            <w:r>
-              <w:rPr>
-                <w:rFonts w:ascii="Courier New" w:eastAsia="Courier New" w:hAnsi="Courier New" w:cs="Courier New"/>
-                <w:sz w:val="18"/>
-                <w:szCs w:val="18"/>
-              </w:rPr>
-              <w:t>str</w:t>
-            </w:r>
-            <w:proofErr w:type="spellEnd"/>
-            <w:r>
-              <w:rPr>
-                <w:rFonts w:ascii="Courier New" w:eastAsia="Courier New" w:hAnsi="Courier New" w:cs="Courier New"/>
-                <w:sz w:val="18"/>
-                <w:szCs w:val="18"/>
-              </w:rPr>
-              <w:t xml:space="preserve">, </w:t>
-            </w:r>
-            <w:proofErr w:type="spellStart"/>
-            <w:r>
-              <w:rPr>
-                <w:rFonts w:ascii="Courier New" w:eastAsia="Courier New" w:hAnsi="Courier New" w:cs="Courier New"/>
-                <w:sz w:val="18"/>
-                <w:szCs w:val="18"/>
-              </w:rPr>
-              <w:t>float</w:t>
-            </w:r>
-            <w:proofErr w:type="spellEnd"/>
-            <w:r>
-              <w:rPr>
-                <w:rFonts w:ascii="Courier New" w:eastAsia="Courier New" w:hAnsi="Courier New" w:cs="Courier New"/>
-                <w:sz w:val="18"/>
-                <w:szCs w:val="18"/>
-              </w:rPr>
-              <w:t xml:space="preserve"> | </w:t>
-            </w:r>
-            <w:proofErr w:type="spellStart"/>
-            <w:r>
-              <w:rPr>
-                <w:rFonts w:ascii="Courier New" w:eastAsia="Courier New" w:hAnsi="Courier New" w:cs="Courier New"/>
-                <w:sz w:val="18"/>
-                <w:szCs w:val="18"/>
-              </w:rPr>
-              <w:t>int</w:t>
-            </w:r>
-            <w:proofErr w:type="spellEnd"/>
-            <w:r>
-              <w:rPr>
-                <w:rFonts w:ascii="Courier New" w:eastAsia="Courier New" w:hAnsi="Courier New" w:cs="Courier New"/>
-                <w:sz w:val="18"/>
-                <w:szCs w:val="18"/>
-              </w:rPr>
-              <w:t>]:</w:t>
+            <w:r>
+              <w:t>def statistics_python(books: Sequence[Book]) -&gt; dict[str, float | int]:</w:t>
             </w:r>
           </w:p>
           <w:p>
@@ -4477,167 +4222,8 @@
               <w:keepNext/>
               <w:keepLines/>
             </w:pPr>
-            <w:proofErr w:type="spellStart"/>
-            <w:r>
-              <w:rPr>
-                <w:rFonts w:ascii="Courier New" w:eastAsia="Courier New" w:hAnsi="Courier New" w:cs="Courier New"/>
-                <w:sz w:val="18"/>
-                <w:szCs w:val="18"/>
-              </w:rPr>
-              <w:t>def</w:t>
-            </w:r>
-            <w:proofErr w:type="spellEnd"/>
-            <w:r>
-              <w:rPr>
-                <w:rFonts w:ascii="Courier New" w:eastAsia="Courier New" w:hAnsi="Courier New" w:cs="Courier New"/>
-                <w:sz w:val="18"/>
-                <w:szCs w:val="18"/>
-              </w:rPr>
-              <w:t xml:space="preserve"> </w:t>
-            </w:r>
-            <w:proofErr w:type="spellStart"/>
-            <w:r>
-              <w:rPr>
-                <w:rFonts w:ascii="Courier New" w:eastAsia="Courier New" w:hAnsi="Courier New" w:cs="Courier New"/>
-                <w:sz w:val="18"/>
-                <w:szCs w:val="18"/>
-              </w:rPr>
-              <w:t>pages_numpy</w:t>
-            </w:r>
-            <w:proofErr w:type="spellEnd"/>
-            <w:r>
-              <w:rPr>
-                <w:rFonts w:ascii="Courier New" w:eastAsia="Courier New" w:hAnsi="Courier New" w:cs="Courier New"/>
-                <w:sz w:val="18"/>
-                <w:szCs w:val="18"/>
-              </w:rPr>
-              <w:t>(</w:t>
-            </w:r>
-            <w:proofErr w:type="spellStart"/>
-            <w:r>
-              <w:rPr>
-                <w:rFonts w:ascii="Courier New" w:eastAsia="Courier New" w:hAnsi="Courier New" w:cs="Courier New"/>
-                <w:sz w:val="18"/>
-                <w:szCs w:val="18"/>
-              </w:rPr>
-              <w:t>books</w:t>
-            </w:r>
-            <w:proofErr w:type="spellEnd"/>
-            <w:r>
-              <w:rPr>
-                <w:rFonts w:ascii="Courier New" w:eastAsia="Courier New" w:hAnsi="Courier New" w:cs="Courier New"/>
-                <w:sz w:val="18"/>
-                <w:szCs w:val="18"/>
-              </w:rPr>
-              <w:t xml:space="preserve">: </w:t>
-            </w:r>
-            <w:proofErr w:type="spellStart"/>
-            <w:r>
-              <w:rPr>
-                <w:rFonts w:ascii="Courier New" w:eastAsia="Courier New" w:hAnsi="Courier New" w:cs="Courier New"/>
-                <w:sz w:val="18"/>
-                <w:szCs w:val="18"/>
-              </w:rPr>
-              <w:t>Sequence</w:t>
-            </w:r>
-            <w:proofErr w:type="spellEnd"/>
-            <w:r>
-              <w:rPr>
-                <w:rFonts w:ascii="Courier New" w:eastAsia="Courier New" w:hAnsi="Courier New" w:cs="Courier New"/>
-                <w:sz w:val="18"/>
-                <w:szCs w:val="18"/>
-              </w:rPr>
-              <w:t>[</w:t>
-            </w:r>
-            <w:proofErr w:type="spellStart"/>
-            <w:r>
-              <w:rPr>
-                <w:rFonts w:ascii="Courier New" w:eastAsia="Courier New" w:hAnsi="Courier New" w:cs="Courier New"/>
-                <w:sz w:val="18"/>
-                <w:szCs w:val="18"/>
-              </w:rPr>
-              <w:t>Book</w:t>
-            </w:r>
-            <w:proofErr w:type="spellEnd"/>
-            <w:r>
-              <w:rPr>
-                <w:rFonts w:ascii="Courier New" w:eastAsia="Courier New" w:hAnsi="Courier New" w:cs="Courier New"/>
-                <w:sz w:val="18"/>
-                <w:szCs w:val="18"/>
-              </w:rPr>
-              <w:t xml:space="preserve">]) -&gt; </w:t>
-            </w:r>
-            <w:proofErr w:type="spellStart"/>
-            <w:r>
-              <w:rPr>
-                <w:rFonts w:ascii="Courier New" w:eastAsia="Courier New" w:hAnsi="Courier New" w:cs="Courier New"/>
-                <w:sz w:val="18"/>
-                <w:szCs w:val="18"/>
-              </w:rPr>
-              <w:t>dict</w:t>
-            </w:r>
-            <w:proofErr w:type="spellEnd"/>
-            <w:r>
-              <w:rPr>
-                <w:rFonts w:ascii="Courier New" w:eastAsia="Courier New" w:hAnsi="Courier New" w:cs="Courier New"/>
-                <w:sz w:val="18"/>
-                <w:szCs w:val="18"/>
-              </w:rPr>
-              <w:t>[</w:t>
-            </w:r>
-            <w:proofErr w:type="spellStart"/>
-            <w:r>
-              <w:rPr>
-                <w:rFonts w:ascii="Courier New" w:eastAsia="Courier New" w:hAnsi="Courier New" w:cs="Courier New"/>
-                <w:sz w:val="18"/>
-                <w:szCs w:val="18"/>
-              </w:rPr>
-              <w:t>str</w:t>
-            </w:r>
-            <w:proofErr w:type="spellEnd"/>
-            <w:r>
-              <w:rPr>
-                <w:rFonts w:ascii="Courier New" w:eastAsia="Courier New" w:hAnsi="Courier New" w:cs="Courier New"/>
-                <w:sz w:val="18"/>
-                <w:szCs w:val="18"/>
-              </w:rPr>
-              <w:t xml:space="preserve">, </w:t>
-            </w:r>
-            <w:proofErr w:type="spellStart"/>
-            <w:r>
-              <w:rPr>
-                <w:rFonts w:ascii="Courier New" w:eastAsia="Courier New" w:hAnsi="Courier New" w:cs="Courier New"/>
-                <w:sz w:val="18"/>
-                <w:szCs w:val="18"/>
-              </w:rPr>
-              <w:t>float</w:t>
-            </w:r>
-            <w:proofErr w:type="spellEnd"/>
-            <w:r>
-              <w:rPr>
-                <w:rFonts w:ascii="Courier New" w:eastAsia="Courier New" w:hAnsi="Courier New" w:cs="Courier New"/>
-                <w:sz w:val="18"/>
-                <w:szCs w:val="18"/>
-              </w:rPr>
-              <w:t xml:space="preserve"> | </w:t>
-            </w:r>
-            <w:proofErr w:type="spellStart"/>
-            <w:r>
-              <w:rPr>
-                <w:rFonts w:ascii="Courier New" w:eastAsia="Courier New" w:hAnsi="Courier New" w:cs="Courier New"/>
-                <w:sz w:val="18"/>
-                <w:szCs w:val="18"/>
-              </w:rPr>
-              <w:t>int</w:t>
-            </w:r>
-            <w:proofErr w:type="spellEnd"/>
-            <w:r>
-              <w:rPr>
-                <w:rFonts w:ascii="Courier New" w:eastAsia="Courier New" w:hAnsi="Courier New" w:cs="Courier New"/>
-                <w:sz w:val="18"/>
-                <w:szCs w:val="18"/>
-              </w:rPr>
-              <w:t>]:</w:t>
+            <w:r>
+              <w:t>def statistics_numpy(books: Sequence[Book]) -&gt; dict[str, float | int]:</w:t>
             </w:r>
           </w:p>
           <w:p>
@@ -5373,71 +4959,7 @@
         <w:jc w:val="both"/>
       </w:pPr>
       <w:r>
-        <w:t xml:space="preserve">Базова версія </w:t>
-      </w:r>
-      <w:proofErr w:type="spellStart"/>
-      <w:r>
-        <w:t>pages_python</w:t>
-      </w:r>
-      <w:proofErr w:type="spellEnd"/>
-      <w:r>
-        <w:t xml:space="preserve"> двічі проходить по списку сторінок (середнє та дисперсія) у </w:t>
-      </w:r>
-      <w:proofErr w:type="spellStart"/>
-      <w:r>
-        <w:t>Python</w:t>
-      </w:r>
-      <w:proofErr w:type="spellEnd"/>
-      <w:r>
-        <w:t xml:space="preserve">-циклах. Версія </w:t>
-      </w:r>
-      <w:proofErr w:type="spellStart"/>
-      <w:r>
-        <w:t>pages_numpy</w:t>
-      </w:r>
-      <w:proofErr w:type="spellEnd"/>
-      <w:r>
-        <w:t xml:space="preserve"> формує масив </w:t>
-      </w:r>
-      <w:proofErr w:type="spellStart"/>
-      <w:r>
-        <w:t>numpy.fromiter</w:t>
-      </w:r>
-      <w:proofErr w:type="spellEnd"/>
-      <w:r>
-        <w:t xml:space="preserve"> і викликає </w:t>
-      </w:r>
-      <w:proofErr w:type="spellStart"/>
-      <w:r>
-        <w:t>mean</w:t>
-      </w:r>
-      <w:proofErr w:type="spellEnd"/>
-      <w:r>
-        <w:t xml:space="preserve">, </w:t>
-      </w:r>
-      <w:proofErr w:type="spellStart"/>
-      <w:r>
-        <w:t>min</w:t>
-      </w:r>
-      <w:proofErr w:type="spellEnd"/>
-      <w:r>
-        <w:t xml:space="preserve">, </w:t>
-      </w:r>
-      <w:proofErr w:type="spellStart"/>
-      <w:r>
-        <w:t>max</w:t>
-      </w:r>
-      <w:proofErr w:type="spellEnd"/>
-      <w:r>
-        <w:t xml:space="preserve">, </w:t>
-      </w:r>
-      <w:proofErr w:type="spellStart"/>
-      <w:r>
-        <w:t>std</w:t>
-      </w:r>
-      <w:proofErr w:type="spellEnd"/>
-      <w:r>
-        <w:t xml:space="preserve"> у скомпільованому коді. Для обох функцій результат перевіряється на еквівалентність.</w:t>
+        <w:t>Базова версія statistics_python послідовно обчислює статистику (середнє, мінімум, максимум, сума) у Python-циклах. Версія statistics_numpy формує NumPy масив і виконує обчислення через векторизовані операції SIMD. Для обох функцій результат перевіряється на повну еквівалентність.</w:t>
       </w:r>
     </w:p>
     <w:p>
@@ -12168,43 +11690,7 @@
         <w:jc w:val="both"/>
       </w:pPr>
       <w:r>
-        <w:t>Ключ кешу складається з імені клієнта (</w:t>
-      </w:r>
-      <w:proofErr w:type="spellStart"/>
-      <w:r>
-        <w:t>casefold</w:t>
-      </w:r>
-      <w:proofErr w:type="spellEnd"/>
-      <w:r>
-        <w:t xml:space="preserve">) та версії банківської системи. Метод </w:t>
-      </w:r>
-      <w:proofErr w:type="spellStart"/>
-      <w:r>
-        <w:t>add_book</w:t>
-      </w:r>
-      <w:proofErr w:type="spellEnd"/>
-      <w:r>
-        <w:t xml:space="preserve"> збільшує версію і очищає кеш, тому застарілі значення не </w:t>
-      </w:r>
-      <w:r>
-        <w:lastRenderedPageBreak/>
-        <w:t xml:space="preserve">повертаються. У analytics.py також реалізовано альтернативу на </w:t>
-      </w:r>
-      <w:proofErr w:type="spellStart"/>
-      <w:r>
-        <w:t>functools.lru_cache</w:t>
-      </w:r>
-      <w:proofErr w:type="spellEnd"/>
-      <w:r>
-        <w:t xml:space="preserve"> (</w:t>
-      </w:r>
-      <w:proofErr w:type="spellStart"/>
-      <w:r>
-        <w:t>cached_author_summary</w:t>
-      </w:r>
-      <w:proofErr w:type="spellEnd"/>
-      <w:r>
-        <w:t>), яку порівняно в розділі 8.</w:t>
+        <w:t>Ключ кешу складається з імені клієнта (casefold) та версії банківської системи. Метод add_account збільшує версію і очищає кеш, тому застарілі значення не повертаються. У analytics.py також реалізовано альтернативу на functools.lru_cache (cached_group_statistics), яку порівняно в розділі 8.</w:t>
       </w:r>
     </w:p>
     <w:p>
@@ -15168,13 +14654,7 @@
         <w:spacing w:before="120" w:after="80"/>
       </w:pPr>
       <w:r>
-        <w:rPr>
-          <w:i/>
-          <w:iCs/>
-          <w:sz w:val="26"/>
-          <w:szCs w:val="26"/>
-        </w:rPr>
-        <w:t>Таблиця 2 – Час обчислення статистики сторінок (середнє з 3 повторів)</w:t>
+        <w:t>Таблиця 2 – Час обчислення статистики балансів рахунків (середнє з 3 повторів)</w:t>
       </w:r>
     </w:p>
     <w:tbl>
@@ -15835,65 +15315,8 @@
         <w:jc w:val="center"/>
       </w:pPr>
       <w:r>
-        <w:rPr>
-          <w:i/>
-          <w:iCs/>
-          <w:sz w:val="26"/>
-          <w:szCs w:val="26"/>
-        </w:rPr>
-        <w:t xml:space="preserve">Рисунок 2 – Час статистики сторінок: </w:t>
-      </w:r>
-      <w:proofErr w:type="spellStart"/>
-      <w:r>
-        <w:rPr>
-          <w:i/>
-          <w:iCs/>
-          <w:sz w:val="26"/>
-          <w:szCs w:val="26"/>
-        </w:rPr>
-        <w:t>Python</w:t>
-      </w:r>
-      <w:proofErr w:type="spellEnd"/>
-      <w:r>
-        <w:rPr>
-          <w:i/>
-          <w:iCs/>
-          <w:sz w:val="26"/>
-          <w:szCs w:val="26"/>
-        </w:rPr>
-        <w:t xml:space="preserve"> </w:t>
-      </w:r>
-      <w:proofErr w:type="spellStart"/>
-      <w:r>
-        <w:rPr>
-          <w:i/>
-          <w:iCs/>
-          <w:sz w:val="26"/>
-          <w:szCs w:val="26"/>
-        </w:rPr>
-        <w:t>vs</w:t>
-      </w:r>
-      <w:proofErr w:type="spellEnd"/>
-      <w:r>
-        <w:rPr>
-          <w:i/>
-          <w:iCs/>
-          <w:sz w:val="26"/>
-          <w:szCs w:val="26"/>
-        </w:rPr>
-        <w:t xml:space="preserve"> </w:t>
-      </w:r>
-      <w:proofErr w:type="spellStart"/>
-      <w:r>
-        <w:rPr>
-          <w:i/>
-          <w:iCs/>
-          <w:sz w:val="26"/>
-          <w:szCs w:val="26"/>
-        </w:rPr>
-        <w:t>NumPy</w:t>
-      </w:r>
-      <w:proofErr w:type="spellEnd"/>
+        <w:t>Рисунок 2 – Час статистики балансів рахунків: Python vs NumPy</w:t>
+      </w:r>
     </w:p>
     <w:p>
       <w:pPr>
@@ -18103,31 +17526,7 @@
         <w:jc w:val="both"/>
       </w:pPr>
       <w:r>
-        <w:t xml:space="preserve">Профіль </w:t>
-      </w:r>
-      <w:proofErr w:type="spellStart"/>
-      <w:r>
-        <w:t>pages_python</w:t>
-      </w:r>
-      <w:proofErr w:type="spellEnd"/>
-      <w:r>
-        <w:t xml:space="preserve"> (100 000 рахунків), збережений у </w:t>
-      </w:r>
-      <w:proofErr w:type="spellStart"/>
-      <w:r>
-        <w:t>results</w:t>
-      </w:r>
-      <w:proofErr w:type="spellEnd"/>
-      <w:r>
-        <w:t>/</w:t>
-      </w:r>
-      <w:proofErr w:type="spellStart"/>
-      <w:r>
-        <w:t>profile.prof</w:t>
-      </w:r>
-      <w:proofErr w:type="spellEnd"/>
-      <w:r>
-        <w:t>:</w:t>
+        <w:t>Профіль statistics_python (100 000 рахунків), збережений у results/profile.prof:</w:t>
       </w:r>
     </w:p>
     <w:tbl>
@@ -18446,30 +17845,7 @@
               <w:keepLines/>
             </w:pPr>
             <w:r>
-              <w:rPr>
-                <w:rFonts w:ascii="Courier New" w:eastAsia="Courier New" w:hAnsi="Courier New" w:cs="Courier New"/>
-                <w:sz w:val="18"/>
-                <w:szCs w:val="18"/>
-              </w:rPr>
-              <w:t xml:space="preserve">     1    0.002    0.002    0.021  analytics.py:27(</w:t>
-            </w:r>
-            <w:proofErr w:type="spellStart"/>
-            <w:r>
-              <w:rPr>
-                <w:rFonts w:ascii="Courier New" w:eastAsia="Courier New" w:hAnsi="Courier New" w:cs="Courier New"/>
-                <w:sz w:val="18"/>
-                <w:szCs w:val="18"/>
-              </w:rPr>
-              <w:t>pages_python</w:t>
-            </w:r>
-            <w:proofErr w:type="spellEnd"/>
-            <w:r>
-              <w:rPr>
-                <w:rFonts w:ascii="Courier New" w:eastAsia="Courier New" w:hAnsi="Courier New" w:cs="Courier New"/>
-                <w:sz w:val="18"/>
-                <w:szCs w:val="18"/>
-              </w:rPr>
-              <w:t>)</w:t>
+              <w:t xml:space="preserve">     1    0.002    0.002    0.021  analytics.py:27(statistics_python)</w:t>
             </w:r>
           </w:p>
           <w:p>
@@ -19849,43 +19225,7 @@
               <w:spacing w:line="276" w:lineRule="auto"/>
             </w:pPr>
             <w:r>
-              <w:rPr>
-                <w:sz w:val="24"/>
-                <w:szCs w:val="24"/>
-              </w:rPr>
-              <w:t xml:space="preserve">Після </w:t>
-            </w:r>
-            <w:proofErr w:type="spellStart"/>
-            <w:r>
-              <w:rPr>
-                <w:sz w:val="24"/>
-                <w:szCs w:val="24"/>
-              </w:rPr>
-              <w:t>add_book</w:t>
-            </w:r>
-            <w:proofErr w:type="spellEnd"/>
-            <w:r>
-              <w:rPr>
-                <w:sz w:val="24"/>
-                <w:szCs w:val="24"/>
-              </w:rPr>
-              <w:t xml:space="preserve"> (</w:t>
-            </w:r>
-            <w:proofErr w:type="spellStart"/>
-            <w:r>
-              <w:rPr>
-                <w:sz w:val="24"/>
-                <w:szCs w:val="24"/>
-              </w:rPr>
-              <w:t>інвалідація</w:t>
-            </w:r>
-            <w:proofErr w:type="spellEnd"/>
-            <w:r>
-              <w:rPr>
-                <w:sz w:val="24"/>
-                <w:szCs w:val="24"/>
-              </w:rPr>
-              <w:t>)</w:t>
+              <w:t>Після add_account (інвалідація)</w:t>
             </w:r>
           </w:p>
         </w:tc>
@@ -23394,87 +22734,7 @@
         <w:jc w:val="both"/>
       </w:pPr>
       <w:r>
-        <w:t xml:space="preserve">Вимірювання показали, що з розглянутих способів реально прискорює операцію лише </w:t>
-      </w:r>
-      <w:proofErr w:type="spellStart"/>
-      <w:r>
-        <w:t>NumPy-векторизація</w:t>
-      </w:r>
-      <w:proofErr w:type="spellEnd"/>
-      <w:r>
-        <w:t xml:space="preserve"> (у 2,8–3,4 </w:t>
-      </w:r>
-      <w:proofErr w:type="spellStart"/>
-      <w:r>
-        <w:t>раза</w:t>
-      </w:r>
-      <w:proofErr w:type="spellEnd"/>
-      <w:r>
-        <w:t xml:space="preserve"> на статистиці сторінок), а кеш дає велике прискорення повторних запитів (≈ 670×). </w:t>
-      </w:r>
-      <w:proofErr w:type="spellStart"/>
-      <w:r>
-        <w:t>ThreadPoolExecutor</w:t>
-      </w:r>
-      <w:proofErr w:type="spellEnd"/>
-      <w:r>
-        <w:t xml:space="preserve"> сповільнив CPU-</w:t>
-      </w:r>
-      <w:proofErr w:type="spellStart"/>
-      <w:r>
-        <w:t>bound</w:t>
-      </w:r>
-      <w:proofErr w:type="spellEnd"/>
-      <w:r>
-        <w:t xml:space="preserve"> задачу (0,56×) через GIL, </w:t>
-      </w:r>
-      <w:proofErr w:type="spellStart"/>
-      <w:r>
-        <w:t>ProcessPoolExecutor</w:t>
-      </w:r>
-      <w:proofErr w:type="spellEnd"/>
-      <w:r>
-        <w:t xml:space="preserve"> не дав виграшу (0,86×) на середовищі з одним ядром, а потокове читання локальних файлів не прискорилося, бо реального очікування I/O майже не було. </w:t>
-      </w:r>
-      <w:proofErr w:type="spellStart"/>
-      <w:r>
-        <w:t>cProfile</w:t>
-      </w:r>
-      <w:proofErr w:type="spellEnd"/>
-      <w:r>
-        <w:t xml:space="preserve"> виявив, що вузьке місце – </w:t>
-      </w:r>
-      <w:proofErr w:type="spellStart"/>
-      <w:r>
-        <w:t>Python</w:t>
-      </w:r>
-      <w:proofErr w:type="spellEnd"/>
-      <w:r>
-        <w:t xml:space="preserve">-цикли (генераторний вираз у </w:t>
-      </w:r>
-      <w:proofErr w:type="spellStart"/>
-      <w:r>
-        <w:t>pages_python</w:t>
-      </w:r>
-      <w:proofErr w:type="spellEnd"/>
-      <w:r>
-        <w:t xml:space="preserve"> і цикл у </w:t>
-      </w:r>
-      <w:proofErr w:type="spellStart"/>
-      <w:r>
-        <w:t>cpu_score</w:t>
-      </w:r>
-      <w:proofErr w:type="spellEnd"/>
-      <w:r>
-        <w:t xml:space="preserve">), а аналіз </w:t>
-      </w:r>
-      <w:proofErr w:type="spellStart"/>
-      <w:r>
-        <w:t>lru_cache</w:t>
-      </w:r>
-      <w:proofErr w:type="spellEnd"/>
-      <w:r>
-        <w:t>-варіанта показав, що ключ кешу не має містити копію всіх даних.</w:t>
+        <w:t>Вимірювання показали, що з розглянутих способів реально прискорює операцію лише NumPy-векторизація (у 2,8–3,4 раза на статистиці сторінок), а кеш дає велике прискорення повторних запитів (≈ 670×). ThreadPoolExecutor сповільнив CPU-bound задачу (0,56×) через GIL, ProcessPoolExecutor не дав виграшу (0,86×) на середовищі з одним ядром, а потокове читання локальних файлів не прискорилося, бо реального очікування I/O майже не було. cProfile виявив, що вузьке місце – Python-цикли (генераторний вираз у statistics_python і цикл у cpu_score), а аналіз lru_cache-варіанта показав, що ключ кешу не має містити копію всіх даних.</w:t>
       </w:r>
     </w:p>
     <w:p>

</xml_diff>